<commit_message>
Respuesta a LaHaus: decisiones del 19/10 (edad, tarde, campanas activas, casos por frase y hora)
Co-Authored-By: Claude Fable 5.1 <noreply@anthropic.com>
</commit_message>
<xml_diff>
--- a/recursos/comercial/plataforma LaHaus/RESPUESTA_LAHAUS_2026-10-18.docx
+++ b/recursos/comercial/plataforma LaHaus/RESPUESTA_LAHAUS_2026-10-18.docx
@@ -38,7 +38,7 @@
           <w:color w:val="666666"/>
           <w:sz w:val="19"/>
         </w:rPr>
-        <w:t>ANTES DE ENVIAR, gerencia completa o confirma: (a) los dos números o apodos del punto 4; (b) la regla de edad del punto 6 (está escrita como quedó en la base del 6/10: desde 12 en cualquier jornada con acudiente); (c) si la jornada de la tarde se ofrece como "en apertura"; (d) el estado de la campaña Curso Inglés 13/10 en el punto 2.</w:t>
+        <w:t>Decisiones de gerencia 19/10 ya incorporadas: edad (sábados desde 12, entre semana desde 17, excepción solo en la asesoría), tarde (solo en la cita), campaña 13/10 apagada y nueva del 19/10 activa, casos sin número buscados por frase y hora.</w:t>
       </w:r>
     </w:p>
     <w:p>
@@ -108,7 +108,7 @@
           <w:b w:val="0"/>
           <w:sz w:val="21"/>
         </w:rPr>
-        <w:t xml:space="preserve">   a) Clic a WhatsApp, campaña HEIIU_CTWA_BGA_1510 (anuncios V1_VIDEODEHOY, V3_575H, V4_VACANTE). El lead llega con un mensaje prellenado que trae el código del video entre paréntesis. Saludo: "Hola, gracias por escribirnos por el video. Soy el asistente de Heiiu. Para orientarte bien, ¿para qué necesitas el inglés?" Si el prellenado ya trae el motivo (por ejemplo V4: "Necesito el inglés para..."), el agente omite el paso 1, pide el nombre y sigue con el paso 2.</w:t>
+        <w:t xml:space="preserve">   a) Clic a WhatsApp: la campaña nueva que entró el 19 de octubre (reemplaza a la del 15, que quedó pausada). Los videos entran con un mensaje prellenado que trae el código del video entre paréntesis (V1, V3, V4). Saludo: "Hola, gracias por escribirnos por el video. Soy el asistente de Heiiu. Para orientarte bien, ¿para qué necesitas el inglés?" Si el prellenado ya trae el motivo (por ejemplo V4: "Necesito el inglés para..."), el agente omite el paso 1, pide el nombre y sigue con el paso 2.</w:t>
       </w:r>
     </w:p>
     <w:p>
@@ -144,7 +144,7 @@
           <w:b w:val="0"/>
           <w:sz w:val="21"/>
         </w:rPr>
-        <w:t xml:space="preserve">   Campañas pausadas: Au Pair 25/08 y Curso Inglés 30/09. Curso Inglés 13/10: [CONFIRMAR: pausada / activa; si sigue activa usa el saludo a)]. En ningún saludo aparece "Arranque de octubre" ni el nombre de un programa.</w:t>
+        <w:t xml:space="preserve">   Campañas pausadas: Au Pair 25/08, Curso Inglés 30/09, Curso Inglés 13/10 y la de clic a WhatsApp del 15/10. En ningún saludo aparece "Arranque de octubre" ni el nombre de un programa.</w:t>
       </w:r>
     </w:p>
     <w:p>
@@ -190,7 +190,7 @@
           <w:b w:val="0"/>
           <w:sz w:val="21"/>
         </w:rPr>
-        <w:t>4. CASOS (sección 08). Jerson (317 376 1839) y Henry (318 561 8222) ya los tienen; esperamos la respuesta el miércoles 21. Los otros dos:</w:t>
+        <w:t>4. CASOS (sección 08). Jerson (317 376 1839) y Henry (318 561 8222) ya los tienen; esperamos la respuesta el miércoles 21. De los otros dos no tenemos el número, pero ustedes tienen todas las conversaciones del 7 de octubre y se pueden buscar por frase y hora:</w:t>
       </w:r>
     </w:p>
     <w:p>
@@ -202,7 +202,7 @@
           <w:b w:val="0"/>
           <w:sz w:val="21"/>
         </w:rPr>
-        <w:t xml:space="preserve">   • Lead del 7/10 que dijo "quiero reforzar lo que ya sé": [NÚMERO O APODO DE WHATSAPP].</w:t>
+        <w:t xml:space="preserve">   • El lead que escribió "quiero reforzar lo que ya sé" el 7/10, y el agente le repitió la pregunta de nivel.</w:t>
       </w:r>
     </w:p>
     <w:p>
@@ -214,7 +214,19 @@
           <w:b w:val="0"/>
           <w:sz w:val="21"/>
         </w:rPr>
-        <w:t xml:space="preserve">   • María Eugenia (7/10, 12:34 pm): [NÚMERO O APODO DE WHATSAPP].</w:t>
+        <w:t xml:space="preserve">   • La conversación del 7/10 a las 12:34 pm en la que nuestra asesora escribió "déjame que la asesora te escriba hoy" y el agente siguió escribiendo después.</w:t>
+      </w:r>
+    </w:p>
+    <w:p>
+      <w:pPr>
+        <w:spacing w:after="80"/>
+      </w:pPr>
+      <w:r>
+        <w:rPr>
+          <w:b w:val="0"/>
+          <w:sz w:val="21"/>
+        </w:rPr>
+        <w:t xml:space="preserve">   Si no aparecen con esos datos, nos dicen y los buscamos conversación por conversación.</w:t>
       </w:r>
     </w:p>
     <w:p>
@@ -283,7 +295,7 @@
           <w:b w:val="0"/>
           <w:sz w:val="21"/>
         </w:rPr>
-        <w:t>6. EDAD Y JORNADAS (pasos 2 y 4 del flujo). Dos ajustes de configuración:</w:t>
+        <w:t>6. EDAD Y JORNADAS (pasos 2 y 4 del flujo). Dos precisiones de configuración:</w:t>
       </w:r>
     </w:p>
     <w:p>
@@ -295,7 +307,7 @@
           <w:b w:val="0"/>
           <w:sz w:val="21"/>
         </w:rPr>
-        <w:t xml:space="preserve">   • Paso 2: la edad mínima es 12 años en cualquier jornada. De 12 a 17, el acudiente asiste a la asesoría y firma, y entre semana se exige el compromiso de trabajo diario fuera de clase. Menores de 12: no se agenda. Hoy el agente dice "entre semana desde 17", y eso no es así.</w:t>
+        <w:t xml:space="preserve">   • Paso 2: se mantiene "sábados desde 12 años; entre semana desde 17". Pero si un padre pide entre semana para un hijo de 12 a 16, el agente no dice que no: responde "es una opción que se revisa con el acudiente en la asesoría" y agenda. Menores de 12: no se agenda.</w:t>
       </w:r>
     </w:p>
     <w:p>
@@ -307,7 +319,7 @@
           <w:b w:val="0"/>
           <w:sz w:val="21"/>
         </w:rPr>
-        <w:t xml:space="preserve">   • Paso 4: además de mañana (8:00 a 12:00) y noche (6:30 a 8:30 p. m.), existe la jornada de la tarde en apertura: si el lead solo puede en la tarde, el agente registra la franja que le sirve y agenda igual la asesoría. No se le dice que no.</w:t>
+        <w:t xml:space="preserve">   • Paso 4: el agente sigue ofreciendo solo mañana (8:00 a 12:00) y noche (6:30 a 8:30 p. m.). Si el lead dice que solo puede en la tarde, no se descalifica: "eso lo revisas con la asesora en la cita" y agenda igual. La tarde no se ofrece como opción por iniciativa del agente.</w:t>
       </w:r>
     </w:p>
     <w:p>

</xml_diff>

<commit_message>
Respuesta a LaHaus: solo la campana del 19/10 activa; formulario pausado
Co-Authored-By: Claude Fable 5.1 <noreply@anthropic.com>
</commit_message>
<xml_diff>
--- a/recursos/comercial/plataforma LaHaus/RESPUESTA_LAHAUS_2026-10-18.docx
+++ b/recursos/comercial/plataforma LaHaus/RESPUESTA_LAHAUS_2026-10-18.docx
@@ -96,7 +96,7 @@
           <w:b w:val="0"/>
           <w:sz w:val="21"/>
         </w:rPr>
-        <w:t>2. SALUDOS POR FLUJO (sección 07). Hoy hay dos flujos activos y uno pausado:</w:t>
+        <w:t>2. SALUDOS POR FLUJO (sección 07). Hoy hay un solo flujo activo:</w:t>
       </w:r>
     </w:p>
     <w:p>
@@ -120,7 +120,7 @@
           <w:b w:val="0"/>
           <w:sz w:val="21"/>
         </w:rPr>
-        <w:t xml:space="preserve">   b) Formulario, campaña HEIIU_FORM_CONTROL_1510. El formulario trae el motivo (trabajo / irme del país / estudio / mi hijo). Saludo: "Hola, [nombre]. Gracias por dejarnos tus datos. Soy el asistente de Heiiu. Vi que el inglés es para [motivo del formulario]; para orientarte bien, ¿es para ti o para alguien más?" Si el motivo no se puede leer, usa el saludo del punto 1.</w:t>
+        <w:t xml:space="preserve">   b) Formulario: por ahora no hay campañas de formulario activas. Cuando volvamos a prender una, el saludo será: "Hola, [nombre]. Gracias por dejarnos tus datos. Soy el asistente de Heiiu. Vi que el inglés es para [motivo del formulario]; para orientarte bien, ¿es para ti o para alguien más?" Les avisamos antes de activarla.</w:t>
       </w:r>
     </w:p>
     <w:p>
@@ -144,7 +144,7 @@
           <w:b w:val="0"/>
           <w:sz w:val="21"/>
         </w:rPr>
-        <w:t xml:space="preserve">   Campañas pausadas: Au Pair 25/08, Curso Inglés 30/09, Curso Inglés 13/10 y la de clic a WhatsApp del 15/10. En ningún saludo aparece "Arranque de octubre" ni el nombre de un programa.</w:t>
+        <w:t xml:space="preserve">   Campañas pausadas: Au Pair 25/08, Curso Inglés 30/09, Curso Inglés 13/10, el formulario de control 1510 y la de clic a WhatsApp del 15/10. En ningún saludo aparece "Arranque de octubre" ni el nombre de un programa.</w:t>
       </w:r>
     </w:p>
     <w:p>

</xml_diff>